<commit_message>
Dodaj druk zakresu czynności nauczyciela angielskiego, informatyki i WF
Druk dla nauczyciela przedmiotów w szkole specjalnej na Kodeksie pracy
(30 godzin tygodniowo): obowiązki wspólne oraz bloki dla języka obcego,
informatyki i wychowania fizycznego z podstawą prawną; egzemplarz dla
Kacpra K. W druku edukacji wczesnoszkolnej oświadczenie zapisano w formie
neutralnej.

Co-Authored-By: Claude Fable 5.1 <noreply@anthropic.com>
Claude-Session: https://claude.ai/code/session_01TpzdqAbF5UXKbVWA2Z13uB
</commit_message>
<xml_diff>
--- a/dokumenty/druk-zakres-czynnosci-edukacja-wczesnoszkolna.docx
+++ b/dokumenty/druk-zakres-czynnosci-edukacja-wczesnoszkolna.docx
@@ -7825,7 +7825,7 @@
           <w:sz w:val="18"/>
           <w:szCs w:val="18"/>
         </w:rPr>
-        <w:t xml:space="preserve">Oświadczam, że zapoznałam się z zakresem czynności i obowiązków, przyjmuję go do wiadomości i stosowania oraz zobowiązuję się do wykonywania pracy zgodnie z nim, regulaminem pracy, statutem szkoły i obowiązującymi przepisami. Zakres czynności sporządzono w dwóch jednobrzmiących egzemplarzach: jeden dla pracownika, drugi do akt osobowych (część B).</w:t>
+        <w:t xml:space="preserve">Potwierdzam zapoznanie się z zakresem czynności i obowiązków, przyjmuję go do wiadomości i stosowania oraz zobowiązuję się do wykonywania pracy zgodnie z nim, regulaminem pracy, statutem szkoły i obowiązującymi przepisami. Zakres czynności sporządzono w dwóch jednobrzmiących egzemplarzach: jeden dla pracownika, drugi do akt osobowych (część B).</w:t>
       </w:r>
     </w:p>
     <w:p>
@@ -15780,7 +15780,7 @@
           <w:sz w:val="18"/>
           <w:szCs w:val="18"/>
         </w:rPr>
-        <w:t xml:space="preserve">Oświadczam, że zapoznałam się z zakresem czynności i obowiązków, przyjmuję go do wiadomości i stosowania oraz zobowiązuję się do wykonywania pracy zgodnie z nim, regulaminem pracy, statutem szkoły i obowiązującymi przepisami. Zakres czynności sporządzono w dwóch jednobrzmiących egzemplarzach: jeden dla pracownika, drugi do akt osobowych (część B).</w:t>
+        <w:t xml:space="preserve">Potwierdzam zapoznanie się z zakresem czynności i obowiązków, przyjmuję go do wiadomości i stosowania oraz zobowiązuję się do wykonywania pracy zgodnie z nim, regulaminem pracy, statutem szkoły i obowiązującymi przepisami. Zakres czynności sporządzono w dwóch jednobrzmiących egzemplarzach: jeden dla pracownika, drugi do akt osobowych (część B).</w:t>
       </w:r>
     </w:p>
     <w:p>

</xml_diff>